<commit_message>
Resume: switch to Pine green to match the website
Co-Authored-By: Claude Opus 5.5 <noreply@anthropic.com>
Claude-Session: https://claude.ai/code/session_0141FXvmwk2SXiHGjvoFxyuJ
</commit_message>
<xml_diff>
--- a/resume/Mohammed-Ismail-Shaikh_Senior-AI-Engineer.docx
+++ b/resume/Mohammed-Ismail-Shaikh_Senior-AI-Engineer.docx
@@ -26,7 +26,7 @@
         <w:tc>
           <w:tcPr>
             <w:tcW w:type="dxa" w:w="3742"/>
-            <w:shd w:val="clear" w:color="auto" w:fill="1E2D45"/>
+            <w:shd w:val="clear" w:color="auto" w:fill="1E3A36"/>
             <w:tcMar>
               <w:top w:w="510" w:type="dxa"/>
               <w:left w:w="397" w:type="dxa"/>
@@ -59,7 +59,7 @@
                 <w:rFonts w:ascii="Georgia" w:hAnsi="Georgia" w:eastAsia="Georgia"/>
                 <w:b w:val="0"/>
                 <w:i/>
-                <w:color w:val="6FB1E8"/>
+                <w:color w:val="8CCFB8"/>
                 <w:sz w:val="21"/>
               </w:rPr>
               <w:t>Senior AI Engineer | AI Solution Architecture | Agentic AI</w:t>
@@ -74,7 +74,7 @@
                 <w:rFonts w:ascii="Calibri" w:hAnsi="Calibri" w:eastAsia="Calibri"/>
                 <w:b w:val="0"/>
                 <w:i w:val="0"/>
-                <w:color w:val="C9D3E2"/>
+                <w:color w:val="C4D8D3"/>
                 <w:sz w:val="18"/>
               </w:rPr>
               <w:t>md.ismaaill@gmail.com</w:t>
@@ -89,7 +89,7 @@
                 <w:rFonts w:ascii="Calibri" w:hAnsi="Calibri" w:eastAsia="Calibri"/>
                 <w:b w:val="0"/>
                 <w:i w:val="0"/>
-                <w:color w:val="C9D3E2"/>
+                <w:color w:val="C4D8D3"/>
                 <w:sz w:val="18"/>
               </w:rPr>
               <w:t>+91 86899 04688</w:t>
@@ -104,7 +104,7 @@
                 <w:rFonts w:ascii="Calibri" w:hAnsi="Calibri" w:eastAsia="Calibri"/>
                 <w:b w:val="0"/>
                 <w:i w:val="0"/>
-                <w:color w:val="C9D3E2"/>
+                <w:color w:val="C4D8D3"/>
                 <w:sz w:val="18"/>
               </w:rPr>
               <w:t>linkedin.com/in/iamismail</w:t>
@@ -119,7 +119,7 @@
                 <w:rFonts w:ascii="Calibri" w:hAnsi="Calibri" w:eastAsia="Calibri"/>
                 <w:b w:val="0"/>
                 <w:i w:val="0"/>
-                <w:color w:val="C9D3E2"/>
+                <w:color w:val="C4D8D3"/>
                 <w:sz w:val="18"/>
               </w:rPr>
               <w:t>github.com/mdism</w:t>
@@ -134,7 +134,7 @@
                 <w:rFonts w:ascii="Calibri" w:hAnsi="Calibri" w:eastAsia="Calibri"/>
                 <w:b w:val="0"/>
                 <w:i w:val="0"/>
-                <w:color w:val="C9D3E2"/>
+                <w:color w:val="C4D8D3"/>
                 <w:sz w:val="18"/>
               </w:rPr>
               <w:t>shaikhismail.com</w:t>
@@ -149,7 +149,7 @@
                 <w:rFonts w:ascii="Calibri" w:hAnsi="Calibri" w:eastAsia="Calibri"/>
                 <w:b w:val="0"/>
                 <w:i w:val="0"/>
-                <w:color w:val="C9D3E2"/>
+                <w:color w:val="C4D8D3"/>
                 <w:sz w:val="18"/>
               </w:rPr>
               <w:t>Notice period: 60 days</w:t>
@@ -159,7 +159,7 @@
             <w:pPr>
               <w:spacing w:before="200" w:after="80"/>
               <w:pBdr>
-                <w:bottom w:val="single" w:sz="8" w:space="2" w:color="6FB1E8"/>
+                <w:bottom w:val="single" w:sz="8" w:space="2" w:color="8CCFB8"/>
               </w:pBdr>
             </w:pPr>
             <w:r>
@@ -197,7 +197,7 @@
                 <w:rFonts w:ascii="Calibri" w:hAnsi="Calibri" w:eastAsia="Calibri"/>
                 <w:b w:val="0"/>
                 <w:i w:val="0"/>
-                <w:color w:val="C9D3E2"/>
+                <w:color w:val="C4D8D3"/>
                 <w:sz w:val="17"/>
               </w:rPr>
               <w:t>engineering, automation &amp; AI</w:t>
@@ -227,7 +227,7 @@
                 <w:rFonts w:ascii="Calibri" w:hAnsi="Calibri" w:eastAsia="Calibri"/>
                 <w:b w:val="0"/>
                 <w:i w:val="0"/>
-                <w:color w:val="C9D3E2"/>
+                <w:color w:val="C4D8D3"/>
                 <w:sz w:val="17"/>
               </w:rPr>
               <w:t>led teams of 4–6 engineers</w:t>
@@ -257,7 +257,7 @@
                 <w:rFonts w:ascii="Calibri" w:hAnsi="Calibri" w:eastAsia="Calibri"/>
                 <w:b w:val="0"/>
                 <w:i w:val="0"/>
-                <w:color w:val="C9D3E2"/>
+                <w:color w:val="C4D8D3"/>
                 <w:sz w:val="17"/>
               </w:rPr>
               <w:t>triage time saved by AI agent platform</w:t>
@@ -287,7 +287,7 @@
                 <w:rFonts w:ascii="Calibri" w:hAnsi="Calibri" w:eastAsia="Calibri"/>
                 <w:b w:val="0"/>
                 <w:i w:val="0"/>
-                <w:color w:val="C9D3E2"/>
+                <w:color w:val="C4D8D3"/>
                 <w:sz w:val="17"/>
               </w:rPr>
               <w:t>~400 hours saved per month</w:t>
@@ -317,7 +317,7 @@
                 <w:rFonts w:ascii="Calibri" w:hAnsi="Calibri" w:eastAsia="Calibri"/>
                 <w:b w:val="0"/>
                 <w:i w:val="0"/>
-                <w:color w:val="C9D3E2"/>
+                <w:color w:val="C4D8D3"/>
                 <w:sz w:val="17"/>
               </w:rPr>
               <w:t>Databricks · Anthropic · LangChain</w:t>
@@ -327,7 +327,7 @@
             <w:pPr>
               <w:spacing w:before="200" w:after="80"/>
               <w:pBdr>
-                <w:bottom w:val="single" w:sz="8" w:space="2" w:color="6FB1E8"/>
+                <w:bottom w:val="single" w:sz="8" w:space="2" w:color="8CCFB8"/>
               </w:pBdr>
             </w:pPr>
             <w:r>
@@ -365,7 +365,7 @@
                 <w:rFonts w:ascii="Calibri" w:hAnsi="Calibri" w:eastAsia="Calibri"/>
                 <w:b w:val="0"/>
                 <w:i w:val="0"/>
-                <w:color w:val="C9D3E2"/>
+                <w:color w:val="C4D8D3"/>
                 <w:sz w:val="18"/>
               </w:rPr>
               <w:t>AI Solution Architecture, System Design, Requirements to Production, Cost &amp; Scalability Trade-offs, Team Leadership</w:t>
@@ -395,7 +395,7 @@
                 <w:rFonts w:ascii="Calibri" w:hAnsi="Calibri" w:eastAsia="Calibri"/>
                 <w:b w:val="0"/>
                 <w:i w:val="0"/>
-                <w:color w:val="C9D3E2"/>
+                <w:color w:val="C4D8D3"/>
                 <w:sz w:val="18"/>
               </w:rPr>
               <w:t>LangChain, LangGraph, CrewAI, LlamaIndex, RAG, Multi-Agent Systems, Model Context Protocol (MCP), Prompt Engineering, OpenAI API, Ollama</w:t>
@@ -425,7 +425,7 @@
                 <w:rFonts w:ascii="Calibri" w:hAnsi="Calibri" w:eastAsia="Calibri"/>
                 <w:b w:val="0"/>
                 <w:i w:val="0"/>
-                <w:color w:val="C9D3E2"/>
+                <w:color w:val="C4D8D3"/>
                 <w:sz w:val="18"/>
               </w:rPr>
               <w:t>LLM-as-Judge, Human-in-the-loop, LLM Observability (Arize Phoenix)</w:t>
@@ -455,7 +455,7 @@
                 <w:rFonts w:ascii="Calibri" w:hAnsi="Calibri" w:eastAsia="Calibri"/>
                 <w:b w:val="0"/>
                 <w:i w:val="0"/>
-                <w:color w:val="C9D3E2"/>
+                <w:color w:val="C4D8D3"/>
                 <w:sz w:val="18"/>
               </w:rPr>
               <w:t>Docling, Embeddings, Vector Databases</w:t>
@@ -485,7 +485,7 @@
                 <w:rFonts w:ascii="Calibri" w:hAnsi="Calibri" w:eastAsia="Calibri"/>
                 <w:b w:val="0"/>
                 <w:i w:val="0"/>
-                <w:color w:val="C9D3E2"/>
+                <w:color w:val="C4D8D3"/>
                 <w:sz w:val="18"/>
               </w:rPr>
               <w:t>Python, Django, FastAPI, REST APIs, Microservices, Docker, PostgreSQL, MySQL, MongoDB</w:t>
@@ -515,7 +515,7 @@
                 <w:rFonts w:ascii="Calibri" w:hAnsi="Calibri" w:eastAsia="Calibri"/>
                 <w:b w:val="0"/>
                 <w:i w:val="0"/>
-                <w:color w:val="C9D3E2"/>
+                <w:color w:val="C4D8D3"/>
                 <w:sz w:val="18"/>
               </w:rPr>
               <w:t>n8n, Automation Anywhere, RPA, ETL</w:t>
@@ -545,7 +545,7 @@
                 <w:rFonts w:ascii="Calibri" w:hAnsi="Calibri" w:eastAsia="Calibri"/>
                 <w:b w:val="0"/>
                 <w:i w:val="0"/>
-                <w:color w:val="C9D3E2"/>
+                <w:color w:val="C4D8D3"/>
                 <w:sz w:val="18"/>
               </w:rPr>
               <w:t>Embedded C, IoT</w:t>
@@ -555,7 +555,7 @@
             <w:pPr>
               <w:spacing w:before="200" w:after="80"/>
               <w:pBdr>
-                <w:bottom w:val="single" w:sz="8" w:space="2" w:color="6FB1E8"/>
+                <w:bottom w:val="single" w:sz="8" w:space="2" w:color="8CCFB8"/>
               </w:pBdr>
             </w:pPr>
             <w:r>
@@ -593,7 +593,7 @@
                 <w:rFonts w:ascii="Calibri" w:hAnsi="Calibri" w:eastAsia="Calibri"/>
                 <w:b w:val="0"/>
                 <w:i w:val="0"/>
-                <w:color w:val="C9D3E2"/>
+                <w:color w:val="C4D8D3"/>
                 <w:sz w:val="17"/>
               </w:rPr>
               <w:t>University of Mumbai | 2026</w:t>
@@ -623,7 +623,7 @@
                 <w:rFonts w:ascii="Calibri" w:hAnsi="Calibri" w:eastAsia="Calibri"/>
                 <w:b w:val="0"/>
                 <w:i w:val="0"/>
-                <w:color w:val="C9D3E2"/>
+                <w:color w:val="C4D8D3"/>
                 <w:sz w:val="17"/>
               </w:rPr>
               <w:t>NES's Gangamai College of Engineering | 2014</w:t>
@@ -645,7 +645,7 @@
             <w:pPr>
               <w:spacing w:before="200" w:after="80"/>
               <w:pBdr>
-                <w:bottom w:val="single" w:sz="8" w:space="2" w:color="1E2D45"/>
+                <w:bottom w:val="single" w:sz="8" w:space="2" w:color="235E55"/>
               </w:pBdr>
             </w:pPr>
             <w:r>
@@ -653,7 +653,7 @@
                 <w:rFonts w:ascii="Calibri" w:hAnsi="Calibri" w:eastAsia="Calibri"/>
                 <w:b/>
                 <w:i w:val="0"/>
-                <w:color w:val="1E2D45"/>
+                <w:color w:val="235E55"/>
                 <w:sz w:val="22"/>
               </w:rPr>
               <w:t>PROFILE</w:t>
@@ -668,7 +668,7 @@
                 <w:rFonts w:ascii="Calibri" w:hAnsi="Calibri" w:eastAsia="Calibri"/>
                 <w:b w:val="0"/>
                 <w:i w:val="0"/>
-                <w:color w:val="222222"/>
+                <w:color w:val="10261A"/>
                 <w:sz w:val="19"/>
               </w:rPr>
               <w:t>Senior AI Engineer and team lead with 12 years across backend engineering, process automation and embedded systems, focused on designing and delivering Agentic AI and Generative AI solutions end to end. Takes AI use cases from business requirements to production: solution architecture, RAG and multi-agent systems with LangChain, LangGraph, CrewAI and LlamaIndex, guardrails through LLM-as-Judge and human-in-the-loop review, observability, and cost and scalability decisions, built on Python, Django and FastAPI.</w:t>
@@ -678,7 +678,7 @@
             <w:pPr>
               <w:spacing w:before="200" w:after="80"/>
               <w:pBdr>
-                <w:bottom w:val="single" w:sz="8" w:space="2" w:color="1E2D45"/>
+                <w:bottom w:val="single" w:sz="8" w:space="2" w:color="235E55"/>
               </w:pBdr>
             </w:pPr>
             <w:r>
@@ -686,7 +686,7 @@
                 <w:rFonts w:ascii="Calibri" w:hAnsi="Calibri" w:eastAsia="Calibri"/>
                 <w:b/>
                 <w:i w:val="0"/>
-                <w:color w:val="1E2D45"/>
+                <w:color w:val="235E55"/>
                 <w:sz w:val="22"/>
               </w:rPr>
               <w:t>EXPERIENCE</w:t>
@@ -704,7 +704,7 @@
                 <w:rFonts w:ascii="Calibri" w:hAnsi="Calibri" w:eastAsia="Calibri"/>
                 <w:b/>
                 <w:i w:val="0"/>
-                <w:color w:val="1E2D45"/>
+                <w:color w:val="235E55"/>
                 <w:sz w:val="21"/>
               </w:rPr>
               <w:t>Orange Business Services</w:t>
@@ -714,7 +714,7 @@
                 <w:rFonts w:ascii="Calibri" w:hAnsi="Calibri" w:eastAsia="Calibri"/>
                 <w:b w:val="0"/>
                 <w:i w:val="0"/>
-                <w:color w:val="555555"/>
+                <w:color w:val="4A5F52"/>
                 <w:sz w:val="19"/>
               </w:rPr>
               <w:tab/>
@@ -730,7 +730,7 @@
                 <w:rFonts w:ascii="Georgia" w:hAnsi="Georgia" w:eastAsia="Georgia"/>
                 <w:b w:val="0"/>
                 <w:i/>
-                <w:color w:val="555555"/>
+                <w:color w:val="4A5F52"/>
                 <w:sz w:val="20"/>
               </w:rPr>
               <w:t>Senior Software Engineer</w:t>
@@ -746,7 +746,7 @@
                 <w:rFonts w:ascii="Calibri" w:hAnsi="Calibri" w:eastAsia="Calibri"/>
                 <w:b w:val="0"/>
                 <w:i w:val="0"/>
-                <w:color w:val="1E2D45"/>
+                <w:color w:val="235E55"/>
                 <w:sz w:val="18"/>
               </w:rPr>
               <w:t xml:space="preserve">•  </w:t>
@@ -756,7 +756,7 @@
                 <w:rFonts w:ascii="Calibri" w:hAnsi="Calibri" w:eastAsia="Calibri"/>
                 <w:b/>
                 <w:i w:val="0"/>
-                <w:color w:val="222222"/>
+                <w:color w:val="10261A"/>
                 <w:sz w:val="18"/>
               </w:rPr>
               <w:t xml:space="preserve">Team Leadership: </w:t>
@@ -766,7 +766,7 @@
                 <w:rFonts w:ascii="Calibri" w:hAnsi="Calibri" w:eastAsia="Calibri"/>
                 <w:b w:val="0"/>
                 <w:i w:val="0"/>
-                <w:color w:val="222222"/>
+                <w:color w:val="10261A"/>
                 <w:sz w:val="18"/>
               </w:rPr>
               <w:t>Lead a team of 4–6 engineers across AI and backend projects, owning technical design and delivery.</w:t>
@@ -782,7 +782,7 @@
                 <w:rFonts w:ascii="Calibri" w:hAnsi="Calibri" w:eastAsia="Calibri"/>
                 <w:b w:val="0"/>
                 <w:i w:val="0"/>
-                <w:color w:val="1E2D45"/>
+                <w:color w:val="235E55"/>
                 <w:sz w:val="18"/>
               </w:rPr>
               <w:t xml:space="preserve">•  </w:t>
@@ -792,7 +792,7 @@
                 <w:rFonts w:ascii="Calibri" w:hAnsi="Calibri" w:eastAsia="Calibri"/>
                 <w:b/>
                 <w:i w:val="0"/>
-                <w:color w:val="222222"/>
+                <w:color w:val="10261A"/>
                 <w:sz w:val="18"/>
               </w:rPr>
               <w:t xml:space="preserve">AI Vulnerability Automation Platform: </w:t>
@@ -802,7 +802,7 @@
                 <w:rFonts w:ascii="Calibri" w:hAnsi="Calibri" w:eastAsia="Calibri"/>
                 <w:b w:val="0"/>
                 <w:i w:val="0"/>
-                <w:color w:val="222222"/>
+                <w:color w:val="10261A"/>
                 <w:sz w:val="18"/>
               </w:rPr>
               <w:t>Designed the architecture and built an agentic AI platform, live in production, that cut daily advisory triage from 2 hours to about a minute, saving ~40 hours of analyst time per month (~500 hours a year). It ingests CERT advisories from email, GitHub and RSS feeds, extracts structured data with LLMs, validates results with LLM-as-Judge and human-in-the-loop review, matches them to customer assets and routes each advisory to the owning team.</w:t>
@@ -818,7 +818,7 @@
                 <w:rFonts w:ascii="Calibri" w:hAnsi="Calibri" w:eastAsia="Calibri"/>
                 <w:b w:val="0"/>
                 <w:i w:val="0"/>
-                <w:color w:val="1E2D45"/>
+                <w:color w:val="235E55"/>
                 <w:sz w:val="18"/>
               </w:rPr>
               <w:t xml:space="preserve">•  </w:t>
@@ -828,7 +828,7 @@
                 <w:rFonts w:ascii="Calibri" w:hAnsi="Calibri" w:eastAsia="Calibri"/>
                 <w:b/>
                 <w:i w:val="0"/>
-                <w:color w:val="222222"/>
+                <w:color w:val="10261A"/>
                 <w:sz w:val="18"/>
               </w:rPr>
               <w:t xml:space="preserve">Enterprise Document RAG Solution: </w:t>
@@ -838,7 +838,7 @@
                 <w:rFonts w:ascii="Calibri" w:hAnsi="Calibri" w:eastAsia="Calibri"/>
                 <w:b w:val="0"/>
                 <w:i w:val="0"/>
-                <w:color w:val="222222"/>
+                <w:color w:val="10261A"/>
                 <w:sz w:val="18"/>
               </w:rPr>
               <w:t>Designed and built a RAG solution, live in production, over complex technical PDFs with multi-page tables that answers questions and generates first-draft HLD/LLD design documents (LangChain, LlamaIndex, custom chunking, vector database), including the LLM hosting, infrastructure and cost-performance design.</w:t>
@@ -854,7 +854,7 @@
                 <w:rFonts w:ascii="Calibri" w:hAnsi="Calibri" w:eastAsia="Calibri"/>
                 <w:b w:val="0"/>
                 <w:i w:val="0"/>
-                <w:color w:val="1E2D45"/>
+                <w:color w:val="235E55"/>
                 <w:sz w:val="18"/>
               </w:rPr>
               <w:t xml:space="preserve">•  </w:t>
@@ -864,7 +864,7 @@
                 <w:rFonts w:ascii="Calibri" w:hAnsi="Calibri" w:eastAsia="Calibri"/>
                 <w:b/>
                 <w:i w:val="0"/>
-                <w:color w:val="222222"/>
+                <w:color w:val="10261A"/>
                 <w:sz w:val="18"/>
               </w:rPr>
               <w:t xml:space="preserve">Backend Platform and Data Pipelines: </w:t>
@@ -874,7 +874,7 @@
                 <w:rFonts w:ascii="Calibri" w:hAnsi="Calibri" w:eastAsia="Calibri"/>
                 <w:b w:val="0"/>
                 <w:i w:val="0"/>
-                <w:color w:val="222222"/>
+                <w:color w:val="10261A"/>
                 <w:sz w:val="18"/>
               </w:rPr>
               <w:t>Owned API design and data modelling for Django REST services on PostgreSQL and MySQL, and built Python ETL pipelines for email monitoring, web data extraction and automated reporting.</w:t>
@@ -892,7 +892,7 @@
                 <w:rFonts w:ascii="Calibri" w:hAnsi="Calibri" w:eastAsia="Calibri"/>
                 <w:b/>
                 <w:i w:val="0"/>
-                <w:color w:val="1E2D45"/>
+                <w:color w:val="235E55"/>
                 <w:sz w:val="21"/>
               </w:rPr>
               <w:t>Infogain India Private Limited</w:t>
@@ -902,7 +902,7 @@
                 <w:rFonts w:ascii="Calibri" w:hAnsi="Calibri" w:eastAsia="Calibri"/>
                 <w:b w:val="0"/>
                 <w:i w:val="0"/>
-                <w:color w:val="555555"/>
+                <w:color w:val="4A5F52"/>
                 <w:sz w:val="19"/>
               </w:rPr>
               <w:tab/>
@@ -918,7 +918,7 @@
                 <w:rFonts w:ascii="Georgia" w:hAnsi="Georgia" w:eastAsia="Georgia"/>
                 <w:b w:val="0"/>
                 <w:i/>
-                <w:color w:val="555555"/>
+                <w:color w:val="4A5F52"/>
                 <w:sz w:val="20"/>
               </w:rPr>
               <w:t>RPA Development Consultant</w:t>
@@ -934,7 +934,7 @@
                 <w:rFonts w:ascii="Calibri" w:hAnsi="Calibri" w:eastAsia="Calibri"/>
                 <w:b w:val="0"/>
                 <w:i w:val="0"/>
-                <w:color w:val="1E2D45"/>
+                <w:color w:val="235E55"/>
                 <w:sz w:val="18"/>
               </w:rPr>
               <w:t xml:space="preserve">•  </w:t>
@@ -944,7 +944,7 @@
                 <w:rFonts w:ascii="Calibri" w:hAnsi="Calibri" w:eastAsia="Calibri"/>
                 <w:b w:val="0"/>
                 <w:i w:val="0"/>
-                <w:color w:val="222222"/>
+                <w:color w:val="10261A"/>
                 <w:sz w:val="18"/>
               </w:rPr>
               <w:t>Led a team of 4–6 developers delivering client automation engagements end to end, from process discovery with business stakeholders through solution design, delivery and production support.</w:t>
@@ -960,7 +960,7 @@
                 <w:rFonts w:ascii="Calibri" w:hAnsi="Calibri" w:eastAsia="Calibri"/>
                 <w:b w:val="0"/>
                 <w:i w:val="0"/>
-                <w:color w:val="1E2D45"/>
+                <w:color w:val="235E55"/>
                 <w:sz w:val="18"/>
               </w:rPr>
               <w:t xml:space="preserve">•  </w:t>
@@ -970,7 +970,7 @@
                 <w:rFonts w:ascii="Calibri" w:hAnsi="Calibri" w:eastAsia="Calibri"/>
                 <w:b w:val="0"/>
                 <w:i w:val="0"/>
-                <w:color w:val="222222"/>
+                <w:color w:val="10261A"/>
                 <w:sz w:val="18"/>
               </w:rPr>
               <w:t>Delivered 25+ automations with Excel VBA, VBScript and Power Query, saving an estimated 400+ hours of manual work per month.</w:t>
@@ -986,7 +986,7 @@
                 <w:rFonts w:ascii="Calibri" w:hAnsi="Calibri" w:eastAsia="Calibri"/>
                 <w:b w:val="0"/>
                 <w:i w:val="0"/>
-                <w:color w:val="1E2D45"/>
+                <w:color w:val="235E55"/>
                 <w:sz w:val="18"/>
               </w:rPr>
               <w:t xml:space="preserve">•  </w:t>
@@ -996,7 +996,7 @@
                 <w:rFonts w:ascii="Calibri" w:hAnsi="Calibri" w:eastAsia="Calibri"/>
                 <w:b w:val="0"/>
                 <w:i w:val="0"/>
-                <w:color w:val="222222"/>
+                <w:color w:val="10261A"/>
                 <w:sz w:val="18"/>
               </w:rPr>
               <w:t>Authored solution and process design documents (SDD/PDD) used for client sign-off and hand-over.</w:t>
@@ -1014,7 +1014,7 @@
                 <w:rFonts w:ascii="Calibri" w:hAnsi="Calibri" w:eastAsia="Calibri"/>
                 <w:b/>
                 <w:i w:val="0"/>
-                <w:color w:val="1E2D45"/>
+                <w:color w:val="235E55"/>
                 <w:sz w:val="20"/>
               </w:rPr>
               <w:t>XLNC Technologies</w:t>
@@ -1024,7 +1024,7 @@
                 <w:rFonts w:ascii="Georgia" w:hAnsi="Georgia" w:eastAsia="Georgia"/>
                 <w:b w:val="0"/>
                 <w:i/>
-                <w:color w:val="555555"/>
+                <w:color w:val="4A5F52"/>
                 <w:sz w:val="18"/>
               </w:rPr>
               <w:t xml:space="preserve"> | RPA Developer</w:t>
@@ -1034,7 +1034,7 @@
                 <w:rFonts w:ascii="Calibri" w:hAnsi="Calibri" w:eastAsia="Calibri"/>
                 <w:b w:val="0"/>
                 <w:i w:val="0"/>
-                <w:color w:val="555555"/>
+                <w:color w:val="4A5F52"/>
                 <w:sz w:val="18"/>
               </w:rPr>
               <w:tab/>
@@ -1053,7 +1053,7 @@
                 <w:rFonts w:ascii="Calibri" w:hAnsi="Calibri" w:eastAsia="Calibri"/>
                 <w:b/>
                 <w:i w:val="0"/>
-                <w:color w:val="1E2D45"/>
+                <w:color w:val="235E55"/>
                 <w:sz w:val="20"/>
               </w:rPr>
               <w:t>Kinikar Electronics &amp; Tech Services</w:t>
@@ -1063,7 +1063,7 @@
                 <w:rFonts w:ascii="Georgia" w:hAnsi="Georgia" w:eastAsia="Georgia"/>
                 <w:b w:val="0"/>
                 <w:i/>
-                <w:color w:val="555555"/>
+                <w:color w:val="4A5F52"/>
                 <w:sz w:val="18"/>
               </w:rPr>
               <w:t xml:space="preserve"> | Senior Electronics Engineer</w:t>
@@ -1073,7 +1073,7 @@
                 <w:rFonts w:ascii="Calibri" w:hAnsi="Calibri" w:eastAsia="Calibri"/>
                 <w:b w:val="0"/>
                 <w:i w:val="0"/>
-                <w:color w:val="555555"/>
+                <w:color w:val="4A5F52"/>
                 <w:sz w:val="18"/>
               </w:rPr>
               <w:tab/>
@@ -1092,7 +1092,7 @@
                 <w:rFonts w:ascii="Calibri" w:hAnsi="Calibri" w:eastAsia="Calibri"/>
                 <w:b/>
                 <w:i w:val="0"/>
-                <w:color w:val="1E2D45"/>
+                <w:color w:val="235E55"/>
                 <w:sz w:val="20"/>
               </w:rPr>
               <w:t>Ilogic Academy</w:t>
@@ -1102,7 +1102,7 @@
                 <w:rFonts w:ascii="Georgia" w:hAnsi="Georgia" w:eastAsia="Georgia"/>
                 <w:b w:val="0"/>
                 <w:i/>
-                <w:color w:val="555555"/>
+                <w:color w:val="4A5F52"/>
                 <w:sz w:val="18"/>
               </w:rPr>
               <w:t xml:space="preserve"> | Junior Engineer</w:t>
@@ -1112,7 +1112,7 @@
                 <w:rFonts w:ascii="Calibri" w:hAnsi="Calibri" w:eastAsia="Calibri"/>
                 <w:b w:val="0"/>
                 <w:i w:val="0"/>
-                <w:color w:val="555555"/>
+                <w:color w:val="4A5F52"/>
                 <w:sz w:val="18"/>
               </w:rPr>
               <w:tab/>
@@ -1123,7 +1123,7 @@
             <w:pPr>
               <w:spacing w:before="200" w:after="80"/>
               <w:pBdr>
-                <w:bottom w:val="single" w:sz="8" w:space="2" w:color="1E2D45"/>
+                <w:bottom w:val="single" w:sz="8" w:space="2" w:color="235E55"/>
               </w:pBdr>
             </w:pPr>
             <w:r>
@@ -1131,7 +1131,7 @@
                 <w:rFonts w:ascii="Calibri" w:hAnsi="Calibri" w:eastAsia="Calibri"/>
                 <w:b/>
                 <w:i w:val="0"/>
-                <w:color w:val="1E2D45"/>
+                <w:color w:val="235E55"/>
                 <w:sz w:val="22"/>
               </w:rPr>
               <w:t>PROJECTS</w:t>
@@ -1149,7 +1149,7 @@
                 <w:rFonts w:ascii="Calibri" w:hAnsi="Calibri" w:eastAsia="Calibri"/>
                 <w:b/>
                 <w:i w:val="0"/>
-                <w:color w:val="1E2D45"/>
+                <w:color w:val="235E55"/>
                 <w:sz w:val="21"/>
               </w:rPr>
               <w:t>Full-Stack Document RAG Platform</w:t>
@@ -1159,7 +1159,7 @@
                 <w:rFonts w:ascii="Calibri" w:hAnsi="Calibri" w:eastAsia="Calibri"/>
                 <w:b w:val="0"/>
                 <w:i w:val="0"/>
-                <w:color w:val="555555"/>
+                <w:color w:val="4A5F52"/>
                 <w:sz w:val="19"/>
               </w:rPr>
               <w:t xml:space="preserve">  |  github.com/mdism/doc_rag</w:t>
@@ -1169,7 +1169,7 @@
                 <w:rFonts w:ascii="Calibri" w:hAnsi="Calibri" w:eastAsia="Calibri"/>
                 <w:b w:val="0"/>
                 <w:i w:val="0"/>
-                <w:color w:val="555555"/>
+                <w:color w:val="4A5F52"/>
                 <w:sz w:val="19"/>
               </w:rPr>
               <w:tab/>
@@ -1186,7 +1186,7 @@
                 <w:rFonts w:ascii="Calibri" w:hAnsi="Calibri" w:eastAsia="Calibri"/>
                 <w:b w:val="0"/>
                 <w:i w:val="0"/>
-                <w:color w:val="1E2D45"/>
+                <w:color w:val="235E55"/>
                 <w:sz w:val="18"/>
               </w:rPr>
               <w:t xml:space="preserve">•  </w:t>
@@ -1196,7 +1196,7 @@
                 <w:rFonts w:ascii="Calibri" w:hAnsi="Calibri" w:eastAsia="Calibri"/>
                 <w:b w:val="0"/>
                 <w:i w:val="0"/>
-                <w:color w:val="222222"/>
+                <w:color w:val="10261A"/>
                 <w:sz w:val="18"/>
               </w:rPr>
               <w:t>Reference architecture for a self-hosted RAG stack: Docling document parsing, LlamaIndex retrieval, CrewAI agents, PostgreSQL (Dockerised), Ollama with local and remote models, Arize Phoenix tracing and OpenWebUI as the chat interface.</w:t>
@@ -1206,7 +1206,7 @@
             <w:pPr>
               <w:spacing w:before="200" w:after="80"/>
               <w:pBdr>
-                <w:bottom w:val="single" w:sz="8" w:space="2" w:color="1E2D45"/>
+                <w:bottom w:val="single" w:sz="8" w:space="2" w:color="235E55"/>
               </w:pBdr>
             </w:pPr>
             <w:r>
@@ -1214,7 +1214,7 @@
                 <w:rFonts w:ascii="Calibri" w:hAnsi="Calibri" w:eastAsia="Calibri"/>
                 <w:b/>
                 <w:i w:val="0"/>
-                <w:color w:val="1E2D45"/>
+                <w:color w:val="235E55"/>
                 <w:sz w:val="22"/>
               </w:rPr>
               <w:t>AWARDS &amp; CERTIFICATIONS</w:t>
@@ -1230,7 +1230,7 @@
                 <w:rFonts w:ascii="Calibri" w:hAnsi="Calibri" w:eastAsia="Calibri"/>
                 <w:b w:val="0"/>
                 <w:i w:val="0"/>
-                <w:color w:val="1E2D45"/>
+                <w:color w:val="235E55"/>
                 <w:sz w:val="17"/>
               </w:rPr>
               <w:t xml:space="preserve">•  </w:t>
@@ -1240,7 +1240,7 @@
                 <w:rFonts w:ascii="Calibri" w:hAnsi="Calibri" w:eastAsia="Calibri"/>
                 <w:b/>
                 <w:i w:val="0"/>
-                <w:color w:val="222222"/>
+                <w:color w:val="10261A"/>
                 <w:sz w:val="17"/>
               </w:rPr>
               <w:t xml:space="preserve">Award: </w:t>
@@ -1250,7 +1250,7 @@
                 <w:rFonts w:ascii="Calibri" w:hAnsi="Calibri" w:eastAsia="Calibri"/>
                 <w:b w:val="0"/>
                 <w:i w:val="0"/>
-                <w:color w:val="222222"/>
+                <w:color w:val="10261A"/>
                 <w:sz w:val="17"/>
               </w:rPr>
               <w:t>Automation Anywhere Bot Games Season 4 (Nov 2023)</w:t>
@@ -1266,7 +1266,7 @@
                 <w:rFonts w:ascii="Calibri" w:hAnsi="Calibri" w:eastAsia="Calibri"/>
                 <w:b w:val="0"/>
                 <w:i w:val="0"/>
-                <w:color w:val="1E2D45"/>
+                <w:color w:val="235E55"/>
                 <w:sz w:val="17"/>
               </w:rPr>
               <w:t xml:space="preserve">•  </w:t>
@@ -1276,7 +1276,7 @@
                 <w:rFonts w:ascii="Calibri" w:hAnsi="Calibri" w:eastAsia="Calibri"/>
                 <w:b/>
                 <w:i w:val="0"/>
-                <w:color w:val="222222"/>
+                <w:color w:val="10261A"/>
                 <w:sz w:val="17"/>
               </w:rPr>
               <w:t xml:space="preserve">Databricks Academy: </w:t>
@@ -1286,7 +1286,7 @@
                 <w:rFonts w:ascii="Calibri" w:hAnsi="Calibri" w:eastAsia="Calibri"/>
                 <w:b w:val="0"/>
                 <w:i w:val="0"/>
-                <w:color w:val="222222"/>
+                <w:color w:val="10261A"/>
                 <w:sz w:val="17"/>
               </w:rPr>
               <w:t>Generative AI Fundamentals · GenAI Application Evaluation and Governance · GenAI Application Deployment and Monitoring · Building Retrieval Agents · Building Single-Agent Applications</w:t>
@@ -1302,7 +1302,7 @@
                 <w:rFonts w:ascii="Calibri" w:hAnsi="Calibri" w:eastAsia="Calibri"/>
                 <w:b w:val="0"/>
                 <w:i w:val="0"/>
-                <w:color w:val="1E2D45"/>
+                <w:color w:val="235E55"/>
                 <w:sz w:val="17"/>
               </w:rPr>
               <w:t xml:space="preserve">•  </w:t>
@@ -1312,7 +1312,7 @@
                 <w:rFonts w:ascii="Calibri" w:hAnsi="Calibri" w:eastAsia="Calibri"/>
                 <w:b/>
                 <w:i w:val="0"/>
-                <w:color w:val="222222"/>
+                <w:color w:val="10261A"/>
                 <w:sz w:val="17"/>
               </w:rPr>
               <w:t xml:space="preserve">Anthropic Academy: </w:t>
@@ -1322,7 +1322,7 @@
                 <w:rFonts w:ascii="Calibri" w:hAnsi="Calibri" w:eastAsia="Calibri"/>
                 <w:b w:val="0"/>
                 <w:i w:val="0"/>
-                <w:color w:val="222222"/>
+                <w:color w:val="10261A"/>
                 <w:sz w:val="17"/>
               </w:rPr>
               <w:t>Introduction to Model Context Protocol (MCP) · Claude Code in Action</w:t>
@@ -1338,7 +1338,7 @@
                 <w:rFonts w:ascii="Calibri" w:hAnsi="Calibri" w:eastAsia="Calibri"/>
                 <w:b w:val="0"/>
                 <w:i w:val="0"/>
-                <w:color w:val="1E2D45"/>
+                <w:color w:val="235E55"/>
                 <w:sz w:val="17"/>
               </w:rPr>
               <w:t xml:space="preserve">•  </w:t>
@@ -1348,7 +1348,7 @@
                 <w:rFonts w:ascii="Calibri" w:hAnsi="Calibri" w:eastAsia="Calibri"/>
                 <w:b/>
                 <w:i w:val="0"/>
-                <w:color w:val="222222"/>
+                <w:color w:val="10261A"/>
                 <w:sz w:val="17"/>
               </w:rPr>
               <w:t xml:space="preserve">LangChain Academy: </w:t>
@@ -1358,7 +1358,7 @@
                 <w:rFonts w:ascii="Calibri" w:hAnsi="Calibri" w:eastAsia="Calibri"/>
                 <w:b w:val="0"/>
                 <w:i w:val="0"/>
-                <w:color w:val="222222"/>
+                <w:color w:val="10261A"/>
                 <w:sz w:val="17"/>
               </w:rPr>
               <w:t>Introduction to LangChain (Python) · Introduction to Deep Agents (in progress) · LangChain Certified Agent Engineer (in progress)</w:t>
@@ -1374,7 +1374,7 @@
                 <w:rFonts w:ascii="Calibri" w:hAnsi="Calibri" w:eastAsia="Calibri"/>
                 <w:b w:val="0"/>
                 <w:i w:val="0"/>
-                <w:color w:val="1E2D45"/>
+                <w:color w:val="235E55"/>
                 <w:sz w:val="17"/>
               </w:rPr>
               <w:t xml:space="preserve">•  </w:t>
@@ -1384,7 +1384,7 @@
                 <w:rFonts w:ascii="Calibri" w:hAnsi="Calibri" w:eastAsia="Calibri"/>
                 <w:b/>
                 <w:i w:val="0"/>
-                <w:color w:val="222222"/>
+                <w:color w:val="10261A"/>
                 <w:sz w:val="17"/>
               </w:rPr>
               <w:t xml:space="preserve">Hugging Face: </w:t>
@@ -1394,7 +1394,7 @@
                 <w:rFonts w:ascii="Calibri" w:hAnsi="Calibri" w:eastAsia="Calibri"/>
                 <w:b w:val="0"/>
                 <w:i w:val="0"/>
-                <w:color w:val="222222"/>
+                <w:color w:val="10261A"/>
                 <w:sz w:val="17"/>
               </w:rPr>
               <w:t>AI Agents Course (in progress)</w:t>
@@ -1410,7 +1410,7 @@
                 <w:rFonts w:ascii="Calibri" w:hAnsi="Calibri" w:eastAsia="Calibri"/>
                 <w:b w:val="0"/>
                 <w:i w:val="0"/>
-                <w:color w:val="1E2D45"/>
+                <w:color w:val="235E55"/>
                 <w:sz w:val="17"/>
               </w:rPr>
               <w:t xml:space="preserve">•  </w:t>
@@ -1420,7 +1420,7 @@
                 <w:rFonts w:ascii="Calibri" w:hAnsi="Calibri" w:eastAsia="Calibri"/>
                 <w:b/>
                 <w:i w:val="0"/>
-                <w:color w:val="222222"/>
+                <w:color w:val="10261A"/>
                 <w:sz w:val="17"/>
               </w:rPr>
               <w:t xml:space="preserve">Python &amp; Backend: </w:t>
@@ -1430,7 +1430,7 @@
                 <w:rFonts w:ascii="Calibri" w:hAnsi="Calibri" w:eastAsia="Calibri"/>
                 <w:b w:val="0"/>
                 <w:i w:val="0"/>
-                <w:color w:val="222222"/>
+                <w:color w:val="10261A"/>
                 <w:sz w:val="17"/>
               </w:rPr>
               <w:t>CS50's Introduction to Programming with Python, Harvard (2023) · IBM Python for Data Science, AI &amp; Development · REST API with Django REST Framework and Docker (TDD)</w:t>
@@ -1446,7 +1446,7 @@
                 <w:rFonts w:ascii="Calibri" w:hAnsi="Calibri" w:eastAsia="Calibri"/>
                 <w:b w:val="0"/>
                 <w:i w:val="0"/>
-                <w:color w:val="1E2D45"/>
+                <w:color w:val="235E55"/>
                 <w:sz w:val="17"/>
               </w:rPr>
               <w:t xml:space="preserve">•  </w:t>
@@ -1456,7 +1456,7 @@
                 <w:rFonts w:ascii="Calibri" w:hAnsi="Calibri" w:eastAsia="Calibri"/>
                 <w:b/>
                 <w:i w:val="0"/>
-                <w:color w:val="222222"/>
+                <w:color w:val="10261A"/>
                 <w:sz w:val="17"/>
               </w:rPr>
               <w:t xml:space="preserve">Automation Anywhere: </w:t>
@@ -1466,7 +1466,7 @@
                 <w:rFonts w:ascii="Calibri" w:hAnsi="Calibri" w:eastAsia="Calibri"/>
                 <w:b w:val="0"/>
                 <w:i w:val="0"/>
-                <w:color w:val="222222"/>
+                <w:color w:val="10261A"/>
                 <w:sz w:val="17"/>
               </w:rPr>
               <w:t>Advanced RPA Professional · Document Automation Masterclass (2024)</w:t>

</xml_diff>

<commit_message>
Resume: remove blank second page (PDF) and stop it recurring (Word)
The empty paragraph Word keeps after the layout table is now 1pt with no
spacing, so future exports stay on one page.

Co-Authored-By: Claude Opus 5.5 <noreply@anthropic.com>
Claude-Session: https://claude.ai/code/session_0141FXvmwk2SXiHGjvoFxyuJ
</commit_message>
<xml_diff>
--- a/resume/Mohammed-Ismail-Shaikh_Senior-AI-Engineer.docx
+++ b/resume/Mohammed-Ismail-Shaikh_Senior-AI-Engineer.docx
@@ -1253,7 +1253,15 @@
         </w:tc>
       </w:tr>
     </w:tbl>
-    <w:p/>
+    <w:p>
+      <w:pPr>
+        <w:spacing w:before="0" w:after="0" w:line="20" w:lineRule="exact"/>
+        <w:rPr>
+          <w:sz w:val="2"/>
+          <w:szCs w:val="2"/>
+        </w:rPr>
+      </w:pPr>
+    </w:p>
     <w:sectPr>
       <w:pgSz w:w="11906" w:h="16838"/>
       <w:pgMar w:top="0" w:right="0" w:bottom="0" w:left="0" w:header="0" w:footer="0" w:gutter="0"/>

</xml_diff>